<commit_message>
Aplicar revisao dos textos
</commit_message>
<xml_diff>
--- a/revisao/as-historias-do-cao-joaquim-textos-para-revisao.docx
+++ b/revisao/as-historias-do-cao-joaquim-textos-para-revisao.docx
@@ -352,12 +352,7 @@
         <w:widowControl/>
       </w:pPr>
       <w:r>
-        <w:rPr>
-          <w:rFonts w:ascii="Aptos" w:hAnsi="Aptos"/>
-          <w:color w:val="1E1E1E"/>
-          <w:sz w:val="23"/>
-        </w:rPr>
-        <w:t>— Gato Albertooooo!</w:t>
+        <w:t>— Gato Albertooooo!!</w:t>
       </w:r>
     </w:p>
     <w:p>
@@ -378,12 +373,7 @@
         <w:widowControl/>
       </w:pPr>
       <w:r>
-        <w:rPr>
-          <w:rFonts w:ascii="Aptos" w:hAnsi="Aptos"/>
-          <w:color w:val="1E1E1E"/>
-          <w:sz w:val="23"/>
-        </w:rPr>
-        <w:t>— Vamos passear até ao fundo do mar! — anunciou Joaquim.</w:t>
+        <w:t>— Vamos passear até ao fundo do mar! — anunciou o Joaquim.</w:t>
       </w:r>
     </w:p>
     <w:p>
@@ -404,12 +394,7 @@
         <w:widowControl/>
       </w:pPr>
       <w:r>
-        <w:rPr>
-          <w:rFonts w:ascii="Aptos" w:hAnsi="Aptos"/>
-          <w:color w:val="1E1E1E"/>
-          <w:sz w:val="23"/>
-        </w:rPr>
-        <w:t>— Papagaio Gilbertooooo!</w:t>
+        <w:t>— Papagaio Gilbertooooo!!</w:t>
       </w:r>
     </w:p>
     <w:p>
@@ -573,12 +558,7 @@
         <w:widowControl/>
       </w:pPr>
       <w:r>
-        <w:rPr>
-          <w:rFonts w:ascii="Aptos" w:hAnsi="Aptos"/>
-          <w:color w:val="1E1E1E"/>
-          <w:sz w:val="23"/>
-        </w:rPr>
-        <w:t>— Desculpe lá — disse Joaquim. — Eu ainda estou a aprender a conduzir.</w:t>
+        <w:t>— Desculpe lá — disse o Joaquim. — Eu ainda estou a aprender a conduzir.</w:t>
       </w:r>
     </w:p>
     <w:p>
@@ -1136,51 +1116,31 @@
         <w:widowControl/>
       </w:pPr>
       <w:r>
-        <w:rPr>
-          <w:rFonts w:ascii="Aptos" w:hAnsi="Aptos"/>
-          <w:color w:val="1E1E1E"/>
-          <w:sz w:val="23"/>
-        </w:rPr>
-        <w:t>— Gato Albertooooo!</w:t>
-      </w:r>
-    </w:p>
-    <w:p>
-      <w:pPr>
-        <w:widowControl/>
-      </w:pPr>
-      <w:r>
-        <w:rPr>
-          <w:rFonts w:ascii="Aptos" w:hAnsi="Aptos"/>
-          <w:color w:val="1E1E1E"/>
-          <w:sz w:val="23"/>
-        </w:rPr>
-        <w:t>A porta abriu-se devagar e apareceu Alberto, ainda cheio de sono.</w:t>
-      </w:r>
-    </w:p>
-    <w:p>
-      <w:pPr>
-        <w:widowControl/>
-      </w:pPr>
-      <w:r>
-        <w:rPr>
-          <w:rFonts w:ascii="Aptos" w:hAnsi="Aptos"/>
-          <w:color w:val="1E1E1E"/>
-          <w:sz w:val="23"/>
-        </w:rPr>
-        <w:t>— Queres vir comigo ao deserto? — perguntou Joaquim.</w:t>
-      </w:r>
-    </w:p>
-    <w:p>
-      <w:pPr>
-        <w:widowControl/>
-      </w:pPr>
-      <w:r>
-        <w:rPr>
-          <w:rFonts w:ascii="Aptos" w:hAnsi="Aptos"/>
-          <w:color w:val="1E1E1E"/>
-          <w:sz w:val="23"/>
-        </w:rPr>
-        <w:t>Alberto pensou um bocadinho e levantou uma pata.</w:t>
+        <w:t>— Gato Albeeeerto!</w:t>
+      </w:r>
+    </w:p>
+    <w:p>
+      <w:pPr>
+        <w:widowControl/>
+      </w:pPr>
+      <w:r>
+        <w:t>A porta abriu-se devagar e apareceu o Alberto, ainda cheio de sono.</w:t>
+      </w:r>
+    </w:p>
+    <w:p>
+      <w:pPr>
+        <w:widowControl/>
+      </w:pPr>
+      <w:r>
+        <w:t>— Queres vir comigo ao deserto? — perguntou o Joaquim.</w:t>
+      </w:r>
+    </w:p>
+    <w:p>
+      <w:pPr>
+        <w:widowControl/>
+      </w:pPr>
+      <w:r>
+        <w:t>O Alberto pensou um bocadinho e levantou uma pata.</w:t>
       </w:r>
     </w:p>
     <w:p>
@@ -1227,12 +1187,7 @@
         <w:widowControl/>
       </w:pPr>
       <w:r>
-        <w:rPr>
-          <w:rFonts w:ascii="Aptos" w:hAnsi="Aptos"/>
-          <w:color w:val="1E1E1E"/>
-          <w:sz w:val="23"/>
-        </w:rPr>
-        <w:t>Gilberto desceu do céu num instante, pronto para a aventura.</w:t>
+        <w:t>O Gilberto desceu do céu num instante, pronto para a aventura.</w:t>
       </w:r>
     </w:p>
     <w:p>
@@ -1253,12 +1208,7 @@
         <w:widowControl/>
       </w:pPr>
       <w:r>
-        <w:rPr>
-          <w:rFonts w:ascii="Aptos" w:hAnsi="Aptos"/>
-          <w:color w:val="1E1E1E"/>
-          <w:sz w:val="23"/>
-        </w:rPr>
-        <w:t>Quando chegaram, viram dunas para todos os lados e o sol a brilhar lá no alto.</w:t>
+        <w:t>Quando chegaram, viram dunas por todos os lados e o sol a brilhar lá no alto.</w:t>
       </w:r>
     </w:p>
     <w:p>
@@ -1331,12 +1281,7 @@
         <w:widowControl/>
       </w:pPr>
       <w:r>
-        <w:rPr>
-          <w:rFonts w:ascii="Aptos" w:hAnsi="Aptos"/>
-          <w:color w:val="1E1E1E"/>
-          <w:sz w:val="23"/>
-        </w:rPr>
-        <w:t>— O que estará ali por baixo? — perguntou Joaquim.</w:t>
+        <w:t>— O que estará ali por baixo? — perguntou o Joaquim.</w:t>
       </w:r>
     </w:p>
     <w:p>
@@ -1409,12 +1354,7 @@
         <w:widowControl/>
       </w:pPr>
       <w:r>
-        <w:rPr>
-          <w:rFonts w:ascii="Aptos" w:hAnsi="Aptos"/>
-          <w:color w:val="1E1E1E"/>
-          <w:sz w:val="23"/>
-        </w:rPr>
-        <w:t>Alberto escondeu-se atrás de Joaquim. Gilberto voou um pouco mais alto.</w:t>
+        <w:t>O Alberto escondeu-se atrás do Joaquim. O Gilberto voou um pouco mais alto.</w:t>
       </w:r>
     </w:p>
     <w:p>
@@ -1474,12 +1414,7 @@
         <w:widowControl/>
       </w:pPr>
       <w:r>
-        <w:rPr>
-          <w:rFonts w:ascii="Aptos" w:hAnsi="Aptos"/>
-          <w:color w:val="1E1E1E"/>
-          <w:sz w:val="23"/>
-        </w:rPr>
-        <w:t>— O que é um oásis? — perguntou Alberto.</w:t>
+        <w:t>— O que é um oásis? — perguntou o Alberto.</w:t>
       </w:r>
     </w:p>
     <w:p>
@@ -1500,12 +1435,7 @@
         <w:widowControl/>
       </w:pPr>
       <w:r>
-        <w:rPr>
-          <w:rFonts w:ascii="Aptos" w:hAnsi="Aptos"/>
-          <w:color w:val="1E1E1E"/>
-          <w:sz w:val="23"/>
-        </w:rPr>
-        <w:t>Os olhos de Alberto brilharam.</w:t>
+        <w:t>Os olhos do Alberto brilharam.</w:t>
       </w:r>
     </w:p>
     <w:p>
@@ -1565,12 +1495,7 @@
         <w:widowControl/>
       </w:pPr>
       <w:r>
-        <w:rPr>
-          <w:rFonts w:ascii="Aptos" w:hAnsi="Aptos"/>
-          <w:color w:val="1E1E1E"/>
-          <w:sz w:val="23"/>
-        </w:rPr>
-        <w:t>Quando já estavam quase a desistir, Gilberto viu palmeiras e água ao longe.</w:t>
+        <w:t>Quando já estavam quase a desistir, o Gilberto viu palmeiras e água ao longe.</w:t>
       </w:r>
     </w:p>
     <w:p>
@@ -1604,25 +1529,15 @@
         <w:widowControl/>
       </w:pPr>
       <w:r>
-        <w:rPr>
-          <w:rFonts w:ascii="Aptos" w:hAnsi="Aptos"/>
-          <w:color w:val="1E1E1E"/>
-          <w:sz w:val="23"/>
-        </w:rPr>
-        <w:t>Joaquim correu para a água e começou logo a chapinhar.</w:t>
-      </w:r>
-    </w:p>
-    <w:p>
-      <w:pPr>
-        <w:widowControl/>
-      </w:pPr>
-      <w:r>
-        <w:rPr>
-          <w:rFonts w:ascii="Aptos" w:hAnsi="Aptos"/>
-          <w:color w:val="1E1E1E"/>
-          <w:sz w:val="23"/>
-        </w:rPr>
-        <w:t>Alberto saltou de uma pedra e Gilberto fez chover gotas com as asas.</w:t>
+        <w:t>O Joaquim correu para a água e começou logo a chapinhar.</w:t>
+      </w:r>
+    </w:p>
+    <w:p>
+      <w:pPr>
+        <w:widowControl/>
+      </w:pPr>
+      <w:r>
+        <w:t>O Alberto saltou de uma pedra e o Gilberto fez chover gotas com as asas.</w:t>
       </w:r>
     </w:p>
     <w:p>
@@ -1643,12 +1558,7 @@
         <w:widowControl/>
       </w:pPr>
       <w:r>
-        <w:rPr>
-          <w:rFonts w:ascii="Aptos" w:hAnsi="Aptos"/>
-          <w:color w:val="1E1E1E"/>
-          <w:sz w:val="23"/>
-        </w:rPr>
-        <w:t>— Acho que está na hora de irmos para casa — disse Joaquim.</w:t>
+        <w:t>— Acho que está na hora de irmos para casa — disse o Joaquim.</w:t>
       </w:r>
     </w:p>
     <w:p>
@@ -1682,12 +1592,7 @@
         <w:widowControl/>
       </w:pPr>
       <w:r>
-        <w:rPr>
-          <w:rFonts w:ascii="Aptos" w:hAnsi="Aptos"/>
-          <w:color w:val="1E1E1E"/>
-          <w:sz w:val="23"/>
-        </w:rPr>
-        <w:t>Também se lembrou das gargalhadas com Alberto e Gilberto no oásis.</w:t>
+        <w:t>Também se lembrou das gargalhadas com o Alberto e o Gilberto no oásis.</w:t>
       </w:r>
     </w:p>
     <w:p>
@@ -1842,12 +1747,7 @@
         <w:widowControl/>
       </w:pPr>
       <w:r>
-        <w:rPr>
-          <w:rFonts w:ascii="Aptos" w:hAnsi="Aptos"/>
-          <w:color w:val="1E1E1E"/>
-          <w:sz w:val="23"/>
-        </w:rPr>
-        <w:t>Alberto apareceu ainda cheio de sono.</w:t>
+        <w:t>O Alberto apareceu ainda cheio de sono.</w:t>
       </w:r>
     </w:p>
     <w:p>
@@ -1868,12 +1768,7 @@
         <w:widowControl/>
       </w:pPr>
       <w:r>
-        <w:rPr>
-          <w:rFonts w:ascii="Aptos" w:hAnsi="Aptos"/>
-          <w:color w:val="1E1E1E"/>
-          <w:sz w:val="23"/>
-        </w:rPr>
-        <w:t>Alberto lembrou-se de que ainda faltava alguém.</w:t>
+        <w:t>O Alberto lembrou-se de que ainda faltava alguém.</w:t>
       </w:r>
     </w:p>
     <w:p>
@@ -1920,12 +1815,7 @@
         <w:widowControl/>
       </w:pPr>
       <w:r>
-        <w:rPr>
-          <w:rFonts w:ascii="Aptos" w:hAnsi="Aptos"/>
-          <w:color w:val="1E1E1E"/>
-          <w:sz w:val="23"/>
-        </w:rPr>
-        <w:t>Gilberto desceu a bater as asas.</w:t>
+        <w:t>O Gilberto desceu a bater as asas.</w:t>
       </w:r>
     </w:p>
     <w:p>
@@ -1972,12 +1862,7 @@
         <w:widowControl/>
       </w:pPr>
       <w:r>
-        <w:rPr>
-          <w:rFonts w:ascii="Aptos" w:hAnsi="Aptos"/>
-          <w:color w:val="1E1E1E"/>
-          <w:sz w:val="23"/>
-        </w:rPr>
-        <w:t>Joaquim respirou fundo e começou a contar:</w:t>
+        <w:t>O Joaquim respirou fundo e começou a contar:</w:t>
       </w:r>
     </w:p>
     <w:p>
@@ -2050,12 +1935,7 @@
         <w:widowControl/>
       </w:pPr>
       <w:r>
-        <w:rPr>
-          <w:rFonts w:ascii="Aptos" w:hAnsi="Aptos"/>
-          <w:color w:val="1E1E1E"/>
-          <w:sz w:val="23"/>
-        </w:rPr>
-        <w:t>— Uau! — disse Joaquim.</w:t>
+        <w:t>— Uau! — disse o Joaquim.</w:t>
       </w:r>
     </w:p>
     <w:p>
@@ -2115,12 +1995,7 @@
         <w:widowControl/>
       </w:pPr>
       <w:r>
-        <w:rPr>
-          <w:rFonts w:ascii="Aptos" w:hAnsi="Aptos"/>
-          <w:color w:val="1E1E1E"/>
-          <w:sz w:val="23"/>
-        </w:rPr>
-        <w:t>Alberto escondeu-se atrás de Joaquim, mas o dinossauro só estava a comer folhas.</w:t>
+        <w:t>O Alberto escondeu-se atrás do Joaquim, mas o dinossauro só estava a comer folhas.</w:t>
       </w:r>
     </w:p>
     <w:p>
@@ -2141,12 +2016,7 @@
         <w:widowControl/>
       </w:pPr>
       <w:r>
-        <w:rPr>
-          <w:rFonts w:ascii="Aptos" w:hAnsi="Aptos"/>
-          <w:color w:val="1E1E1E"/>
-          <w:sz w:val="23"/>
-        </w:rPr>
-        <w:t>— Acho que ele é nosso amigo — sussurrou Gilberto.</w:t>
+        <w:t>— Acho que ele é nosso amigo — sussurrou o Gilberto.</w:t>
       </w:r>
     </w:p>
     <w:p>
@@ -2219,51 +2089,31 @@
         <w:widowControl/>
       </w:pPr>
       <w:r>
-        <w:rPr>
-          <w:rFonts w:ascii="Aptos" w:hAnsi="Aptos"/>
-          <w:color w:val="1E1E1E"/>
-          <w:sz w:val="23"/>
-        </w:rPr>
-        <w:t>— Fujam! — gritou Joaquim.</w:t>
-      </w:r>
-    </w:p>
-    <w:p>
-      <w:pPr>
-        <w:widowControl/>
-      </w:pPr>
-      <w:r>
-        <w:rPr>
-          <w:rFonts w:ascii="Aptos" w:hAnsi="Aptos"/>
-          <w:color w:val="1E1E1E"/>
-          <w:sz w:val="23"/>
-        </w:rPr>
-        <w:t>Joaquim, Alberto e Gilberto esconderam-se atrás de uma árvore muito larga.</w:t>
-      </w:r>
-    </w:p>
-    <w:p>
-      <w:pPr>
-        <w:widowControl/>
-      </w:pPr>
-      <w:r>
-        <w:rPr>
-          <w:rFonts w:ascii="Aptos" w:hAnsi="Aptos"/>
-          <w:color w:val="1E1E1E"/>
-          <w:sz w:val="23"/>
-        </w:rPr>
-        <w:t>— Como vamos voltar para casa? — perguntou Alberto. — O buraco é alto demais!</w:t>
-      </w:r>
-    </w:p>
-    <w:p>
-      <w:pPr>
-        <w:widowControl/>
-      </w:pPr>
-      <w:r>
-        <w:rPr>
-          <w:rFonts w:ascii="Aptos" w:hAnsi="Aptos"/>
-          <w:color w:val="1E1E1E"/>
-          <w:sz w:val="23"/>
-        </w:rPr>
-        <w:t>Gilberto espreitou por cima dos ramos e viu um vulcão ao longe.</w:t>
+        <w:t>— Fujam! — gritou o Joaquim.</w:t>
+      </w:r>
+    </w:p>
+    <w:p>
+      <w:pPr>
+        <w:widowControl/>
+      </w:pPr>
+      <w:r>
+        <w:t>O Joaquim, o Alberto e o Gilberto esconderam-se atrás de uma árvore muito larga.</w:t>
+      </w:r>
+    </w:p>
+    <w:p>
+      <w:pPr>
+        <w:widowControl/>
+      </w:pPr>
+      <w:r>
+        <w:t>— Como vamos voltar para casa? — perguntou o Alberto. — O buraco é alto demais!</w:t>
+      </w:r>
+    </w:p>
+    <w:p>
+      <w:pPr>
+        <w:widowControl/>
+      </w:pPr>
+      <w:r>
+        <w:t>O Gilberto espreitou por cima dos ramos e viu um vulcão ao longe.</w:t>
       </w:r>
     </w:p>
     <w:p>
@@ -2310,12 +2160,7 @@
         <w:widowControl/>
       </w:pPr>
       <w:r>
-        <w:rPr>
-          <w:rFonts w:ascii="Aptos" w:hAnsi="Aptos"/>
-          <w:color w:val="1E1E1E"/>
-          <w:sz w:val="23"/>
-        </w:rPr>
-        <w:t>Entraram depressa e Joaquim carregou no único botão que havia.</w:t>
+        <w:t>Entraram depressa e o Joaquim carregou no único botão que havia.</w:t>
       </w:r>
     </w:p>
     <w:p>
@@ -2375,12 +2220,7 @@
         <w:widowControl/>
       </w:pPr>
       <w:r>
-        <w:rPr>
-          <w:rFonts w:ascii="Aptos" w:hAnsi="Aptos"/>
-          <w:color w:val="1E1E1E"/>
-          <w:sz w:val="23"/>
-        </w:rPr>
-        <w:t>Já cá fora, Gilberto sacudiu as penas.</w:t>
+        <w:t>Já cá fora, o Gilberto sacudiu as penas.</w:t>
       </w:r>
     </w:p>
     <w:p>
@@ -2414,12 +2254,7 @@
         <w:widowControl/>
       </w:pPr>
       <w:r>
-        <w:rPr>
-          <w:rFonts w:ascii="Aptos" w:hAnsi="Aptos"/>
-          <w:color w:val="1E1E1E"/>
-          <w:sz w:val="23"/>
-        </w:rPr>
-        <w:t>Joaquim deitou-se e lembrou-se da selva, dos dinossauros e do barco de metal.</w:t>
+        <w:t>O Joaquim deitou-se e lembrou-se da selva, dos dinossauros e do barco de metal.</w:t>
       </w:r>
     </w:p>
     <w:p>
@@ -2574,12 +2409,7 @@
         <w:widowControl/>
       </w:pPr>
       <w:r>
-        <w:rPr>
-          <w:rFonts w:ascii="Aptos" w:hAnsi="Aptos"/>
-          <w:color w:val="1E1E1E"/>
-          <w:sz w:val="23"/>
-        </w:rPr>
-        <w:t>Joaquim correu até à casa do seu melhor amigo e bateu à porta.</w:t>
+        <w:t>O Joaquim correu até à casa do seu melhor amigo e bateu à porta.</w:t>
       </w:r>
     </w:p>
     <w:p>
@@ -2613,12 +2443,7 @@
         <w:widowControl/>
       </w:pPr>
       <w:r>
-        <w:rPr>
-          <w:rFonts w:ascii="Aptos" w:hAnsi="Aptos"/>
-          <w:color w:val="1E1E1E"/>
-          <w:sz w:val="23"/>
-        </w:rPr>
-        <w:t>Alberto abriu a porta com ar desconfiado.</w:t>
+        <w:t>O Alberto abriu a porta com ar desconfiado.</w:t>
       </w:r>
     </w:p>
     <w:p>
@@ -2652,12 +2477,7 @@
         <w:widowControl/>
       </w:pPr>
       <w:r>
-        <w:rPr>
-          <w:rFonts w:ascii="Aptos" w:hAnsi="Aptos"/>
-          <w:color w:val="1E1E1E"/>
-          <w:sz w:val="23"/>
-        </w:rPr>
-        <w:t>Alberto levantou o queixo e respondeu:</w:t>
+        <w:t>O Alberto levantou o queixo e respondeu:</w:t>
       </w:r>
     </w:p>
     <w:p>
@@ -2756,12 +2576,7 @@
         <w:widowControl/>
       </w:pPr>
       <w:r>
-        <w:rPr>
-          <w:rFonts w:ascii="Aptos" w:hAnsi="Aptos"/>
-          <w:color w:val="1E1E1E"/>
-          <w:sz w:val="23"/>
-        </w:rPr>
-        <w:t>Joaquim apertou bem o paraquedas.</w:t>
+        <w:t>O Joaquim apertou bem o paraquedas.</w:t>
       </w:r>
     </w:p>
     <w:p>
@@ -2795,12 +2610,7 @@
         <w:widowControl/>
       </w:pPr>
       <w:r>
-        <w:rPr>
-          <w:rFonts w:ascii="Aptos" w:hAnsi="Aptos"/>
-          <w:color w:val="1E1E1E"/>
-          <w:sz w:val="23"/>
-        </w:rPr>
-        <w:t>Gilberto arregalou os olhos.</w:t>
+        <w:t>O Gilberto arregalou os olhos.</w:t>
       </w:r>
     </w:p>
     <w:p>
@@ -2821,25 +2631,15 @@
         <w:widowControl/>
       </w:pPr>
       <w:r>
-        <w:rPr>
-          <w:rFonts w:ascii="Aptos" w:hAnsi="Aptos"/>
-          <w:color w:val="1E1E1E"/>
-          <w:sz w:val="23"/>
-        </w:rPr>
-        <w:t>Joaquim abriu a porta do avião e saltou.</w:t>
-      </w:r>
-    </w:p>
-    <w:p>
-      <w:pPr>
-        <w:widowControl/>
-      </w:pPr>
-      <w:r>
-        <w:rPr>
-          <w:rFonts w:ascii="Aptos" w:hAnsi="Aptos"/>
-          <w:color w:val="1E1E1E"/>
-          <w:sz w:val="23"/>
-        </w:rPr>
-        <w:t>Alberto saltou logo atrás dele, muito confiante.</w:t>
+        <w:t>O Joaquim abriu a porta do avião e saltou.</w:t>
+      </w:r>
+    </w:p>
+    <w:p>
+      <w:pPr>
+        <w:widowControl/>
+      </w:pPr>
+      <w:r>
+        <w:t>O Alberto saltou logo atrás dele, muito confiante.</w:t>
       </w:r>
     </w:p>
     <w:p>
@@ -2860,64 +2660,39 @@
         <w:widowControl/>
       </w:pPr>
       <w:r>
-        <w:rPr>
-          <w:rFonts w:ascii="Aptos" w:hAnsi="Aptos"/>
-          <w:color w:val="1E1E1E"/>
-          <w:sz w:val="23"/>
-        </w:rPr>
-        <w:t>— Afinal preciso de paraquedas! Dêem-me um paraquedas!</w:t>
-      </w:r>
-    </w:p>
-    <w:p>
-      <w:pPr>
-        <w:widowControl/>
-      </w:pPr>
-      <w:r>
-        <w:rPr>
-          <w:rFonts w:ascii="Aptos" w:hAnsi="Aptos"/>
-          <w:color w:val="1E1E1E"/>
-          <w:sz w:val="23"/>
-        </w:rPr>
-        <w:t>Joaquim puxou a corda e o seu paraquedas abriu-se no céu.</w:t>
-      </w:r>
-    </w:p>
-    <w:p>
-      <w:pPr>
-        <w:widowControl/>
-      </w:pPr>
-      <w:r>
-        <w:rPr>
-          <w:rFonts w:ascii="Aptos" w:hAnsi="Aptos"/>
-          <w:color w:val="1E1E1E"/>
-          <w:sz w:val="23"/>
-        </w:rPr>
-        <w:t>Alberto continuou a cair cada vez mais depressa.</w:t>
-      </w:r>
-    </w:p>
-    <w:p>
-      <w:pPr>
-        <w:widowControl/>
-      </w:pPr>
-      <w:r>
-        <w:rPr>
-          <w:rFonts w:ascii="Aptos" w:hAnsi="Aptos"/>
-          <w:color w:val="1E1E1E"/>
-          <w:sz w:val="23"/>
-        </w:rPr>
-        <w:t>— Papagaio Gilberto! Apanha o Gato Alberto! — gritou Joaquim.</w:t>
-      </w:r>
-    </w:p>
-    <w:p>
-      <w:pPr>
-        <w:widowControl/>
-      </w:pPr>
-      <w:r>
-        <w:rPr>
-          <w:rFonts w:ascii="Aptos" w:hAnsi="Aptos"/>
-          <w:color w:val="1E1E1E"/>
-          <w:sz w:val="23"/>
-        </w:rPr>
-        <w:t>Gilberto fechou as asas, mergulhou pelo céu e agarrou Alberto mesmo a tempo.</w:t>
+        <w:t>— Afinal preciso de paraquedas! Deem-me um paraquedas!</w:t>
+      </w:r>
+    </w:p>
+    <w:p>
+      <w:pPr>
+        <w:widowControl/>
+      </w:pPr>
+      <w:r>
+        <w:t>O Joaquim puxou a corda e o seu paraquedas abriu-se no céu.</w:t>
+      </w:r>
+    </w:p>
+    <w:p>
+      <w:pPr>
+        <w:widowControl/>
+      </w:pPr>
+      <w:r>
+        <w:t>O Alberto continuou a cair cada vez mais depressa.</w:t>
+      </w:r>
+    </w:p>
+    <w:p>
+      <w:pPr>
+        <w:widowControl/>
+      </w:pPr>
+      <w:r>
+        <w:t>— Papagaio Gilberto! Apanha o Gato Alberto! — gritou o Joaquim.</w:t>
+      </w:r>
+    </w:p>
+    <w:p>
+      <w:pPr>
+        <w:widowControl/>
+      </w:pPr>
+      <w:r>
+        <w:t>O Gilberto fechou as asas, mergulhou pelo céu e agarrou o Alberto mesmo a tempo.</w:t>
       </w:r>
     </w:p>
     <w:p>
@@ -3016,12 +2791,7 @@
         <w:widowControl/>
       </w:pPr>
       <w:r>
-        <w:rPr>
-          <w:rFonts w:ascii="Aptos" w:hAnsi="Aptos"/>
-          <w:color w:val="1E1E1E"/>
-          <w:sz w:val="23"/>
-        </w:rPr>
-        <w:t>Quando ouviu a história do salto, Pedro ficou espantado.</w:t>
+        <w:t>Quando ouviu a história do salto, o Pedro ficou espantado.</w:t>
       </w:r>
     </w:p>
     <w:p>
@@ -3042,25 +2812,15 @@
         <w:widowControl/>
       </w:pPr>
       <w:r>
-        <w:rPr>
-          <w:rFonts w:ascii="Aptos" w:hAnsi="Aptos"/>
-          <w:color w:val="1E1E1E"/>
-          <w:sz w:val="23"/>
-        </w:rPr>
-        <w:t>Pouco depois, Joaquim pousou suavemente com o paraquedas.</w:t>
-      </w:r>
-    </w:p>
-    <w:p>
-      <w:pPr>
-        <w:widowControl/>
-      </w:pPr>
-      <w:r>
-        <w:rPr>
-          <w:rFonts w:ascii="Aptos" w:hAnsi="Aptos"/>
-          <w:color w:val="1E1E1E"/>
-          <w:sz w:val="23"/>
-        </w:rPr>
-        <w:t>Gilberto deixou Alberto no chão e caiu de costas na relva, exausto.</w:t>
+        <w:t>Pouco depois, o Joaquim pousou suavemente com o paraquedas.</w:t>
+      </w:r>
+    </w:p>
+    <w:p>
+      <w:pPr>
+        <w:widowControl/>
+      </w:pPr>
+      <w:r>
+        <w:t>O Gilberto deixou o Alberto no chão e caiu de costas na relva, exausto.</w:t>
       </w:r>
     </w:p>
     <w:p>
@@ -3081,12 +2841,7 @@
         <w:widowControl/>
       </w:pPr>
       <w:r>
-        <w:rPr>
-          <w:rFonts w:ascii="Aptos" w:hAnsi="Aptos"/>
-          <w:color w:val="1E1E1E"/>
-          <w:sz w:val="23"/>
-        </w:rPr>
-        <w:t>Alberto sacudiu o pelo e levantou a cauda.</w:t>
+        <w:t>O Alberto sacudiu o pelo e levantou a cauda.</w:t>
       </w:r>
     </w:p>
     <w:p>
@@ -3107,12 +2862,7 @@
         <w:widowControl/>
       </w:pPr>
       <w:r>
-        <w:rPr>
-          <w:rFonts w:ascii="Aptos" w:hAnsi="Aptos"/>
-          <w:color w:val="1E1E1E"/>
-          <w:sz w:val="23"/>
-        </w:rPr>
-        <w:t>Joaquim e Pedro olharam um para o outro e desataram a rir.</w:t>
+        <w:t>O Joaquim e o Pedro olharam um para o outro e desataram a rir.</w:t>
       </w:r>
     </w:p>
     <w:p>
@@ -3133,25 +2883,15 @@
         <w:widowControl/>
       </w:pPr>
       <w:r>
-        <w:rPr>
-          <w:rFonts w:ascii="Aptos" w:hAnsi="Aptos"/>
-          <w:color w:val="1E1E1E"/>
-          <w:sz w:val="23"/>
-        </w:rPr>
-        <w:t>Joaquim deitou-se e puxou o cobertor até ao focinho.</w:t>
-      </w:r>
-    </w:p>
-    <w:p>
-      <w:pPr>
-        <w:widowControl/>
-      </w:pPr>
-      <w:r>
-        <w:rPr>
-          <w:rFonts w:ascii="Aptos" w:hAnsi="Aptos"/>
-          <w:color w:val="1E1E1E"/>
-          <w:sz w:val="23"/>
-        </w:rPr>
-        <w:t>À janela apareceram Alberto, Gilberto e a Borboleta Pedro.</w:t>
+        <w:t>O Joaquim deitou-se e puxou o cobertor até ao focinho.</w:t>
+      </w:r>
+    </w:p>
+    <w:p>
+      <w:pPr>
+        <w:widowControl/>
+      </w:pPr>
+      <w:r>
+        <w:t>À janela apareceram o Alberto, o Gilberto e a Borboleta Pedro.</w:t>
       </w:r>
     </w:p>
     <w:p>
@@ -3198,12 +2938,7 @@
         <w:widowControl/>
       </w:pPr>
       <w:r>
-        <w:rPr>
-          <w:rFonts w:ascii="Aptos" w:hAnsi="Aptos"/>
-          <w:color w:val="1E1E1E"/>
-          <w:sz w:val="23"/>
-        </w:rPr>
-        <w:t>Joaquim fechou os olhos a pensar no céu, nas nuvens e no seu paraquedas.</w:t>
+        <w:t>O Joaquim fechou os olhos a pensar no céu, nas nuvens e no seu paraquedas.</w:t>
       </w:r>
     </w:p>
     <w:p>
@@ -3306,25 +3041,15 @@
         <w:widowControl/>
       </w:pPr>
       <w:r>
-        <w:rPr>
-          <w:rFonts w:ascii="Aptos" w:hAnsi="Aptos"/>
-          <w:color w:val="1E1E1E"/>
-          <w:sz w:val="23"/>
-        </w:rPr>
-        <w:t>Joaquim levantou-a com cuidado e teve logo uma ideia para uma nova aventura.</w:t>
-      </w:r>
-    </w:p>
-    <w:p>
-      <w:pPr>
-        <w:widowControl/>
-      </w:pPr>
-      <w:r>
-        <w:rPr>
-          <w:rFonts w:ascii="Aptos" w:hAnsi="Aptos"/>
-          <w:color w:val="1E1E1E"/>
-          <w:sz w:val="23"/>
-        </w:rPr>
-        <w:t>Joaquim correu até à casa do Gato Alberto e bateu à porta.</w:t>
+        <w:t>O Joaquim levantou-a com cuidado e teve logo uma ideia para uma nova aventura.</w:t>
+      </w:r>
+    </w:p>
+    <w:p>
+      <w:pPr>
+        <w:widowControl/>
+      </w:pPr>
+      <w:r>
+        <w:t>O Joaquim correu até à casa do Gato Alberto e bateu à porta.</w:t>
       </w:r>
     </w:p>
     <w:p>
@@ -3358,12 +3083,7 @@
         <w:widowControl/>
       </w:pPr>
       <w:r>
-        <w:rPr>
-          <w:rFonts w:ascii="Aptos" w:hAnsi="Aptos"/>
-          <w:color w:val="1E1E1E"/>
-          <w:sz w:val="23"/>
-        </w:rPr>
-        <w:t>Alberto abriu a porta e apontou para a campainha.</w:t>
+        <w:t>O Alberto abriu a porta e apontou para a campainha.</w:t>
       </w:r>
     </w:p>
     <w:p>
@@ -3397,25 +3117,15 @@
         <w:widowControl/>
       </w:pPr>
       <w:r>
-        <w:rPr>
-          <w:rFonts w:ascii="Aptos" w:hAnsi="Aptos"/>
-          <w:color w:val="1E1E1E"/>
-          <w:sz w:val="23"/>
-        </w:rPr>
-        <w:t>Joaquim mostrou-lhe a pistola mágica.</w:t>
-      </w:r>
-    </w:p>
-    <w:p>
-      <w:pPr>
-        <w:widowControl/>
-      </w:pPr>
-      <w:r>
-        <w:rPr>
-          <w:rFonts w:ascii="Aptos" w:hAnsi="Aptos"/>
-          <w:color w:val="1E1E1E"/>
-          <w:sz w:val="23"/>
-        </w:rPr>
-        <w:t>— Isto parece um brinquedo — disse Alberto.</w:t>
+        <w:t>O Joaquim mostrou-lhe a pistola mágica.</w:t>
+      </w:r>
+    </w:p>
+    <w:p>
+      <w:pPr>
+        <w:widowControl/>
+      </w:pPr>
+      <w:r>
+        <w:t>— Isto parece um brinquedo — disse o Alberto.</w:t>
       </w:r>
     </w:p>
     <w:p>
@@ -3436,12 +3146,7 @@
         <w:widowControl/>
       </w:pPr>
       <w:r>
-        <w:rPr>
-          <w:rFonts w:ascii="Aptos" w:hAnsi="Aptos"/>
-          <w:color w:val="1E1E1E"/>
-          <w:sz w:val="23"/>
-        </w:rPr>
-        <w:t>Alberto achou a ideia maluca, como quase todas as ideias de Joaquim, mas aceitou.</w:t>
+        <w:t>O Alberto achou a ideia maluca, como quase todas as ideias do Joaquim, mas aceitou.</w:t>
       </w:r>
     </w:p>
     <w:p>
@@ -3475,12 +3180,7 @@
         <w:widowControl/>
       </w:pPr>
       <w:r>
-        <w:rPr>
-          <w:rFonts w:ascii="Aptos" w:hAnsi="Aptos"/>
-          <w:color w:val="1E1E1E"/>
-          <w:sz w:val="23"/>
-        </w:rPr>
-        <w:t>Perto da casa de Alberto havia um grande formigueiro.</w:t>
+        <w:t>Perto da casa do Alberto havia um grande formigueiro.</w:t>
       </w:r>
     </w:p>
     <w:p>
@@ -3501,25 +3201,15 @@
         <w:widowControl/>
       </w:pPr>
       <w:r>
-        <w:rPr>
-          <w:rFonts w:ascii="Aptos" w:hAnsi="Aptos"/>
-          <w:color w:val="1E1E1E"/>
-          <w:sz w:val="23"/>
-        </w:rPr>
-        <w:t>— Então vamos falar com a rainha — disse Joaquim.</w:t>
-      </w:r>
-    </w:p>
-    <w:p>
-      <w:pPr>
-        <w:widowControl/>
-      </w:pPr>
-      <w:r>
-        <w:rPr>
-          <w:rFonts w:ascii="Aptos" w:hAnsi="Aptos"/>
-          <w:color w:val="1E1E1E"/>
-          <w:sz w:val="23"/>
-        </w:rPr>
-        <w:t>Apontou a pistola primeiro a Alberto, depois a Gilberto e, por fim, a si próprio.</w:t>
+        <w:t>— Então vamos falar com a rainha — disse o Joaquim.</w:t>
+      </w:r>
+    </w:p>
+    <w:p>
+      <w:pPr>
+        <w:widowControl/>
+      </w:pPr>
+      <w:r>
+        <w:t>Apontou a pistola primeiro ao Alberto, depois ao Gilberto e, por fim, a si próprio.</w:t>
       </w:r>
     </w:p>
     <w:p>
@@ -3605,12 +3295,7 @@
         <w:widowControl/>
       </w:pPr>
       <w:r>
-        <w:rPr>
-          <w:rFonts w:ascii="Aptos" w:hAnsi="Aptos"/>
-          <w:color w:val="1E1E1E"/>
-          <w:sz w:val="23"/>
-        </w:rPr>
-        <w:t>Joaquim apresentou os amigos e explicou que queriam falar com a rainha sobre as visitas à casa de Alberto.</w:t>
+        <w:t>O Joaquim apresentou os amigos e explicou que queriam falar com a rainha sobre as visitas à casa do Alberto.</w:t>
       </w:r>
     </w:p>
     <w:p>
@@ -3657,12 +3342,7 @@
         <w:widowControl/>
       </w:pPr>
       <w:r>
-        <w:rPr>
-          <w:rFonts w:ascii="Aptos" w:hAnsi="Aptos"/>
-          <w:color w:val="1E1E1E"/>
-          <w:sz w:val="23"/>
-        </w:rPr>
-        <w:t>Gilberto iluminava o caminho com a lanterna. Alberto olhava para tudo de boca aberta.</w:t>
+        <w:t>O Gilberto iluminava o caminho com a lanterna. O Alberto olhava para tudo de boca aberta.</w:t>
       </w:r>
     </w:p>
     <w:p>
@@ -3683,25 +3363,15 @@
         <w:widowControl/>
       </w:pPr>
       <w:r>
-        <w:rPr>
-          <w:rFonts w:ascii="Aptos" w:hAnsi="Aptos"/>
-          <w:color w:val="1E1E1E"/>
-          <w:sz w:val="23"/>
-        </w:rPr>
-        <w:t>No fim do túnel encontraram a Rainha das Formigas, muito maior do que as outras e com uma coroa gigantesca.</w:t>
-      </w:r>
-    </w:p>
-    <w:p>
-      <w:pPr>
-        <w:widowControl/>
-      </w:pPr>
-      <w:r>
-        <w:rPr>
-          <w:rFonts w:ascii="Aptos" w:hAnsi="Aptos"/>
-          <w:color w:val="1E1E1E"/>
-          <w:sz w:val="23"/>
-        </w:rPr>
-        <w:t>Alberto explicou que estava cansado de encontrar formigas em casa.</w:t>
+        <w:t>No fim do túnel, encontraram a Rainha das Formigas, muito maior do que as outras e com uma coroa gigantesca.</w:t>
+      </w:r>
+    </w:p>
+    <w:p>
+      <w:pPr>
+        <w:widowControl/>
+      </w:pPr>
+      <w:r>
+        <w:t>O Alberto explicou que estava cansado de encontrar tantas formigas em casa.</w:t>
       </w:r>
     </w:p>
     <w:p>
@@ -3735,12 +3405,7 @@
         <w:widowControl/>
       </w:pPr>
       <w:r>
-        <w:rPr>
-          <w:rFonts w:ascii="Aptos" w:hAnsi="Aptos"/>
-          <w:color w:val="1E1E1E"/>
-          <w:sz w:val="23"/>
-        </w:rPr>
-        <w:t>— É muito doce! — disse Joaquim depois de provar.</w:t>
+        <w:t>— É muito doce! — disse o Joaquim depois de provar.</w:t>
       </w:r>
     </w:p>
     <w:p>
@@ -3774,12 +3439,7 @@
         <w:widowControl/>
       </w:pPr>
       <w:r>
-        <w:rPr>
-          <w:rFonts w:ascii="Aptos" w:hAnsi="Aptos"/>
-          <w:color w:val="1E1E1E"/>
-          <w:sz w:val="23"/>
-        </w:rPr>
-        <w:t>Alberto suspirou. Não queria alimentar as formigas, mas queria ainda menos encontrá-las na cozinha.</w:t>
+        <w:t>O Alberto suspirou. Não queria alimentar as formigas, mas queria ainda menos encontrá-las na cozinha.</w:t>
       </w:r>
     </w:p>
     <w:p>
@@ -3813,12 +3473,7 @@
         <w:widowControl/>
       </w:pPr>
       <w:r>
-        <w:rPr>
-          <w:rFonts w:ascii="Aptos" w:hAnsi="Aptos"/>
-          <w:color w:val="1E1E1E"/>
-          <w:sz w:val="23"/>
-        </w:rPr>
-        <w:t>Já cá fora, Joaquim parou de repente.</w:t>
+        <w:t>Já cá fora, o Joaquim parou de repente.</w:t>
       </w:r>
     </w:p>
     <w:p>
@@ -3865,12 +3520,7 @@
         <w:widowControl/>
       </w:pPr>
       <w:r>
-        <w:rPr>
-          <w:rFonts w:ascii="Aptos" w:hAnsi="Aptos"/>
-          <w:color w:val="1E1E1E"/>
-          <w:sz w:val="23"/>
-        </w:rPr>
-        <w:t>Uma gota enorme caiu em cima de Joaquim e… Plim! Voltou ao tamanho normal.</w:t>
+        <w:t>Uma gota enorme caiu em cima do Joaquim e… Plim! Voltou ao tamanho normal.</w:t>
       </w:r>
     </w:p>
     <w:p>
@@ -3891,12 +3541,7 @@
         <w:widowControl/>
       </w:pPr>
       <w:r>
-        <w:rPr>
-          <w:rFonts w:ascii="Aptos" w:hAnsi="Aptos"/>
-          <w:color w:val="1E1E1E"/>
-          <w:sz w:val="23"/>
-        </w:rPr>
-        <w:t>Gilberto deixou-se molhar e também cresceu. Mas Alberto fugia de cada gota.</w:t>
+        <w:t>O Gilberto deixou-se molhar e também cresceu. Mas o Alberto fugia de cada gota.</w:t>
       </w:r>
     </w:p>
     <w:p>
@@ -3917,25 +3562,15 @@
         <w:widowControl/>
       </w:pPr>
       <w:r>
-        <w:rPr>
-          <w:rFonts w:ascii="Aptos" w:hAnsi="Aptos"/>
-          <w:color w:val="1E1E1E"/>
-          <w:sz w:val="23"/>
-        </w:rPr>
-        <w:t>Joaquim pegou na mangueira e apontou-a ao amigo.</w:t>
-      </w:r>
-    </w:p>
-    <w:p>
-      <w:pPr>
-        <w:widowControl/>
-      </w:pPr>
-      <w:r>
-        <w:rPr>
-          <w:rFonts w:ascii="Aptos" w:hAnsi="Aptos"/>
-          <w:color w:val="1E1E1E"/>
-          <w:sz w:val="23"/>
-        </w:rPr>
-        <w:t>Chuááá! Alberto voltou ao tamanho normal, encharcado da cabeça às patas.</w:t>
+        <w:t>O Joaquim pegou na mangueira e apontou-a ao amigo.</w:t>
+      </w:r>
+    </w:p>
+    <w:p>
+      <w:pPr>
+        <w:widowControl/>
+      </w:pPr>
+      <w:r>
+        <w:t>Chuááá! O Alberto voltou ao tamanho normal, encharcado da cabeça às patas.</w:t>
       </w:r>
     </w:p>
     <w:p>
@@ -3969,12 +3604,7 @@
         <w:widowControl/>
       </w:pPr>
       <w:r>
-        <w:rPr>
-          <w:rFonts w:ascii="Aptos" w:hAnsi="Aptos"/>
-          <w:color w:val="1E1E1E"/>
-          <w:sz w:val="23"/>
-        </w:rPr>
-        <w:t>Alberto pensou um bocadinho e foi para casa secar o pelo. Depois de tanta confusão, todos foram dormir.</w:t>
+        <w:t>O Alberto pensou um bocadinho e foi para casa secar o pelo. Depois de tanta confusão, todos foram dormir.</w:t>
       </w:r>
     </w:p>
     <w:p>
@@ -4103,12 +3733,7 @@
         <w:widowControl/>
       </w:pPr>
       <w:r>
-        <w:rPr>
-          <w:rFonts w:ascii="Aptos" w:hAnsi="Aptos"/>
-          <w:color w:val="1E1E1E"/>
-          <w:sz w:val="23"/>
-        </w:rPr>
-        <w:t>Joaquim levou os patins debaixo do braço e foi até à casa do amigo.</w:t>
+        <w:t>O Joaquim levou os patins debaixo do braço e foi até à casa do amigo.</w:t>
       </w:r>
     </w:p>
     <w:p>
@@ -4142,12 +3767,7 @@
         <w:widowControl/>
       </w:pPr>
       <w:r>
-        <w:rPr>
-          <w:rFonts w:ascii="Aptos" w:hAnsi="Aptos"/>
-          <w:color w:val="1E1E1E"/>
-          <w:sz w:val="23"/>
-        </w:rPr>
-        <w:t>Alberto abriu a porta e olhou para os patins.</w:t>
+        <w:t>O Alberto abriu a porta e olhou para os patins.</w:t>
       </w:r>
     </w:p>
     <w:p>
@@ -4207,25 +3827,15 @@
         <w:widowControl/>
       </w:pPr>
       <w:r>
-        <w:rPr>
-          <w:rFonts w:ascii="Aptos" w:hAnsi="Aptos"/>
-          <w:color w:val="1E1E1E"/>
-          <w:sz w:val="23"/>
-        </w:rPr>
-        <w:t>Gilberto apareceu pouco depois numa trotinete vermelha.</w:t>
-      </w:r>
-    </w:p>
-    <w:p>
-      <w:pPr>
-        <w:widowControl/>
-      </w:pPr>
-      <w:r>
-        <w:rPr>
-          <w:rFonts w:ascii="Aptos" w:hAnsi="Aptos"/>
-          <w:color w:val="1E1E1E"/>
-          <w:sz w:val="23"/>
-        </w:rPr>
-        <w:t>— Joaquim vai de patins, Alberto vai de skate e eu vou de trotinete!</w:t>
+        <w:t>O Gilberto apareceu pouco depois numa trotinete vermelha.</w:t>
+      </w:r>
+    </w:p>
+    <w:p>
+      <w:pPr>
+        <w:widowControl/>
+      </w:pPr>
+      <w:r>
+        <w:t>— O Joaquim vai de patins, o Alberto vai de skate e eu vou de trotinete!</w:t>
       </w:r>
     </w:p>
     <w:p>
@@ -4246,25 +3856,15 @@
         <w:widowControl/>
       </w:pPr>
       <w:r>
-        <w:rPr>
-          <w:rFonts w:ascii="Aptos" w:hAnsi="Aptos"/>
-          <w:color w:val="1E1E1E"/>
-          <w:sz w:val="23"/>
-        </w:rPr>
-        <w:t>No parque, Joaquim subiu até ao alto de uma rampa.</w:t>
-      </w:r>
-    </w:p>
-    <w:p>
-      <w:pPr>
-        <w:widowControl/>
-      </w:pPr>
-      <w:r>
-        <w:rPr>
-          <w:rFonts w:ascii="Aptos" w:hAnsi="Aptos"/>
-          <w:color w:val="1E1E1E"/>
-          <w:sz w:val="23"/>
-        </w:rPr>
-        <w:t>— Tu sabes andar de patins? — perguntou Alberto.</w:t>
+        <w:t>No parque, o Joaquim subiu até ao alto de uma rampa.</w:t>
+      </w:r>
+    </w:p>
+    <w:p>
+      <w:pPr>
+        <w:widowControl/>
+      </w:pPr>
+      <w:r>
+        <w:t>— Tu sabes andar de patins? — perguntou o Alberto.</w:t>
       </w:r>
     </w:p>
     <w:p>
@@ -4285,12 +3885,7 @@
         <w:widowControl/>
       </w:pPr>
       <w:r>
-        <w:rPr>
-          <w:rFonts w:ascii="Aptos" w:hAnsi="Aptos"/>
-          <w:color w:val="1E1E1E"/>
-          <w:sz w:val="23"/>
-        </w:rPr>
-        <w:t>Joaquim empurrou-se para a frente. As rodas aceleraram, as pernas abanaram e os braços rodaram no ar.</w:t>
+        <w:t>O Joaquim empurrou-se para a frente. As rodas aceleraram, as pernas abanaram e os braços rodaram no ar.</w:t>
       </w:r>
     </w:p>
     <w:p>
@@ -4324,25 +3919,15 @@
         <w:widowControl/>
       </w:pPr>
       <w:r>
-        <w:rPr>
-          <w:rFonts w:ascii="Aptos" w:hAnsi="Aptos"/>
-          <w:color w:val="1E1E1E"/>
-          <w:sz w:val="23"/>
-        </w:rPr>
-        <w:t>Alberto saltou para o skate, desceu a rampa e fez uma pirueta como um profissional.</w:t>
-      </w:r>
-    </w:p>
-    <w:p>
-      <w:pPr>
-        <w:widowControl/>
-      </w:pPr>
-      <w:r>
-        <w:rPr>
-          <w:rFonts w:ascii="Aptos" w:hAnsi="Aptos"/>
-          <w:color w:val="1E1E1E"/>
-          <w:sz w:val="23"/>
-        </w:rPr>
-        <w:t>Gilberto também quis mostrar o que sabia fazer.</w:t>
+        <w:t>O Alberto saltou para o skate, desceu a rampa e fez uma pirueta como um profissional.</w:t>
+      </w:r>
+    </w:p>
+    <w:p>
+      <w:pPr>
+        <w:widowControl/>
+      </w:pPr>
+      <w:r>
+        <w:t>O Gilberto também quis mostrar o que sabia fazer.</w:t>
       </w:r>
     </w:p>
     <w:p>
@@ -4363,38 +3948,23 @@
         <w:widowControl/>
       </w:pPr>
       <w:r>
-        <w:rPr>
-          <w:rFonts w:ascii="Aptos" w:hAnsi="Aptos"/>
-          <w:color w:val="1E1E1E"/>
-          <w:sz w:val="23"/>
-        </w:rPr>
-        <w:t>— Isso é batota! — gritaram Joaquim e Alberto. — A trotinete tem de andar no chão!</w:t>
-      </w:r>
-    </w:p>
-    <w:p>
-      <w:pPr>
-        <w:widowControl/>
-      </w:pPr>
-      <w:r>
-        <w:rPr>
-          <w:rFonts w:ascii="Aptos" w:hAnsi="Aptos"/>
-          <w:color w:val="1E1E1E"/>
-          <w:sz w:val="23"/>
-        </w:rPr>
-        <w:t>Gilberto aterrou a rir.</w:t>
-      </w:r>
-    </w:p>
-    <w:p>
-      <w:pPr>
-        <w:widowControl/>
-      </w:pPr>
-      <w:r>
-        <w:rPr>
-          <w:rFonts w:ascii="Aptos" w:hAnsi="Aptos"/>
-          <w:color w:val="1E1E1E"/>
-          <w:sz w:val="23"/>
-        </w:rPr>
-        <w:t>Joaquim respirou fundo e tentou outra vez.</w:t>
+        <w:t>— Isso é batota! — gritaram o Joaquim e o Alberto. — A trotinete tem de andar no chão!</w:t>
+      </w:r>
+    </w:p>
+    <w:p>
+      <w:pPr>
+        <w:widowControl/>
+      </w:pPr>
+      <w:r>
+        <w:t>O Gilberto aterrou a rir.</w:t>
+      </w:r>
+    </w:p>
+    <w:p>
+      <w:pPr>
+        <w:widowControl/>
+      </w:pPr>
+      <w:r>
+        <w:t>O Joaquim respirou fundo e tentou outra vez.</w:t>
       </w:r>
     </w:p>
     <w:p>
@@ -4428,12 +3998,7 @@
         <w:widowControl/>
       </w:pPr>
       <w:r>
-        <w:rPr>
-          <w:rFonts w:ascii="Aptos" w:hAnsi="Aptos"/>
-          <w:color w:val="1E1E1E"/>
-          <w:sz w:val="23"/>
-        </w:rPr>
-        <w:t>Sempre que os patins fugiam para um lado, Joaquim punha-se de pé e recomeçava.</w:t>
+        <w:t>Sempre que os patins fugiam para um lado, o Joaquim punha-se de pé e recomeçava.</w:t>
       </w:r>
     </w:p>
     <w:p>
@@ -4467,51 +4032,31 @@
         <w:widowControl/>
       </w:pPr>
       <w:r>
-        <w:rPr>
-          <w:rFonts w:ascii="Aptos" w:hAnsi="Aptos"/>
-          <w:color w:val="1E1E1E"/>
-          <w:sz w:val="23"/>
-        </w:rPr>
-        <w:t>Joaquim começou a deslizar devagarinho, primeiro em linha reta e depois a fazer curvas.</w:t>
-      </w:r>
-    </w:p>
-    <w:p>
-      <w:pPr>
-        <w:widowControl/>
-      </w:pPr>
-      <w:r>
-        <w:rPr>
-          <w:rFonts w:ascii="Aptos" w:hAnsi="Aptos"/>
-          <w:color w:val="1E1E1E"/>
-          <w:sz w:val="23"/>
-        </w:rPr>
-        <w:t>Quando conseguiu descer uma rampa sem cair, Alberto e Gilberto festejaram.</w:t>
-      </w:r>
-    </w:p>
-    <w:p>
-      <w:pPr>
-        <w:widowControl/>
-      </w:pPr>
-      <w:r>
-        <w:rPr>
-          <w:rFonts w:ascii="Aptos" w:hAnsi="Aptos"/>
-          <w:color w:val="1E1E1E"/>
-          <w:sz w:val="23"/>
-        </w:rPr>
-        <w:t>— Estás a ver? — disse Alberto. — Era preciso ter paciência.</w:t>
-      </w:r>
-    </w:p>
-    <w:p>
-      <w:pPr>
-        <w:widowControl/>
-      </w:pPr>
-      <w:r>
-        <w:rPr>
-          <w:rFonts w:ascii="Aptos" w:hAnsi="Aptos"/>
-          <w:color w:val="1E1E1E"/>
-          <w:sz w:val="23"/>
-        </w:rPr>
-        <w:t>— E quando caímos, levantamo-nos e tentamos outra vez — respondeu Joaquim.</w:t>
+        <w:t>O Joaquim começou a deslizar devagarinho, primeiro em linha reta e depois a fazer curvas.</w:t>
+      </w:r>
+    </w:p>
+    <w:p>
+      <w:pPr>
+        <w:widowControl/>
+      </w:pPr>
+      <w:r>
+        <w:t>Quando conseguiu descer uma rampa sem cair, o Alberto e o Gilberto festejaram.</w:t>
+      </w:r>
+    </w:p>
+    <w:p>
+      <w:pPr>
+        <w:widowControl/>
+      </w:pPr>
+      <w:r>
+        <w:t>— Estás a ver? — disse o Alberto. — Era preciso ter paciência.</w:t>
+      </w:r>
+    </w:p>
+    <w:p>
+      <w:pPr>
+        <w:widowControl/>
+      </w:pPr>
+      <w:r>
+        <w:t>— E quando caímos, levantamo-nos e tentamos outra vez — respondeu o Joaquim.</w:t>
       </w:r>
     </w:p>
     <w:p>
@@ -4532,12 +4077,7 @@
         <w:widowControl/>
       </w:pPr>
       <w:r>
-        <w:rPr>
-          <w:rFonts w:ascii="Aptos" w:hAnsi="Aptos"/>
-          <w:color w:val="1E1E1E"/>
-          <w:sz w:val="23"/>
-        </w:rPr>
-        <w:t>Alberto teve uma última ideia:</w:t>
+        <w:t>O Alberto teve uma última ideia:</w:t>
       </w:r>
     </w:p>
     <w:p>
@@ -4558,12 +4098,7 @@
         <w:widowControl/>
       </w:pPr>
       <w:r>
-        <w:rPr>
-          <w:rFonts w:ascii="Aptos" w:hAnsi="Aptos"/>
-          <w:color w:val="1E1E1E"/>
-          <w:sz w:val="23"/>
-        </w:rPr>
-        <w:t>Os três alinharam-se à saída do parque: Joaquim nos patins, Alberto no skate e Gilberto na trotinete.</w:t>
+        <w:t>Os três alinharam-se à saída do parque: o Joaquim nos patins, o Alberto no skate e o Gilberto na trotinete.</w:t>
       </w:r>
     </w:p>
     <w:p>
@@ -4584,25 +4119,15 @@
         <w:widowControl/>
       </w:pPr>
       <w:r>
-        <w:rPr>
-          <w:rFonts w:ascii="Aptos" w:hAnsi="Aptos"/>
-          <w:color w:val="1E1E1E"/>
-          <w:sz w:val="23"/>
-        </w:rPr>
-        <w:t>Alberto avançou muito depressa e Joaquim seguiu logo atrás.</w:t>
-      </w:r>
-    </w:p>
-    <w:p>
-      <w:pPr>
-        <w:widowControl/>
-      </w:pPr>
-      <w:r>
-        <w:rPr>
-          <w:rFonts w:ascii="Aptos" w:hAnsi="Aptos"/>
-          <w:color w:val="1E1E1E"/>
-          <w:sz w:val="23"/>
-        </w:rPr>
-        <w:t>Gilberto bateu as asas, levantou voo com a trotinete e passou por cima dos dois.</w:t>
+        <w:t>O Alberto avançou muito depressa e o Joaquim seguiu logo atrás.</w:t>
+      </w:r>
+    </w:p>
+    <w:p>
+      <w:pPr>
+        <w:widowControl/>
+      </w:pPr>
+      <w:r>
+        <w:t>O Gilberto bateu as asas, levantou voo com a trotinete e passou por cima dos dois.</w:t>
       </w:r>
     </w:p>
     <w:p>
@@ -4623,12 +4148,7 @@
         <w:widowControl/>
       </w:pPr>
       <w:r>
-        <w:rPr>
-          <w:rFonts w:ascii="Aptos" w:hAnsi="Aptos"/>
-          <w:color w:val="1E1E1E"/>
-          <w:sz w:val="23"/>
-        </w:rPr>
-        <w:t>Gilberto riu, desceu e voltou para junto dos amigos.</w:t>
+        <w:t>O Gilberto riu-se, desceu e voltou para junto dos amigos.</w:t>
       </w:r>
     </w:p>
     <w:p>
@@ -4770,12 +4290,7 @@
         <w:widowControl/>
       </w:pPr>
       <w:r>
-        <w:rPr>
-          <w:rFonts w:ascii="Aptos" w:hAnsi="Aptos"/>
-          <w:color w:val="1E1E1E"/>
-          <w:sz w:val="23"/>
-        </w:rPr>
-        <w:t>Joaquim foi até à casa do seu melhor amigo, bateu à porta e chamou:</w:t>
+        <w:t>O Joaquim foi até à casa do seu melhor amigo, bateu à porta e chamou:</w:t>
       </w:r>
     </w:p>
     <w:p>
@@ -4796,12 +4311,7 @@
         <w:widowControl/>
       </w:pPr>
       <w:r>
-        <w:rPr>
-          <w:rFonts w:ascii="Aptos" w:hAnsi="Aptos"/>
-          <w:color w:val="1E1E1E"/>
-          <w:sz w:val="23"/>
-        </w:rPr>
-        <w:t>Alberto abriu a porta e olhou para todo aquele equipamento.</w:t>
+        <w:t>O Alberto abriu a porta e olhou para todo aquele equipamento.</w:t>
       </w:r>
     </w:p>
     <w:p>
@@ -4822,25 +4332,15 @@
         <w:widowControl/>
       </w:pPr>
       <w:r>
-        <w:rPr>
-          <w:rFonts w:ascii="Aptos" w:hAnsi="Aptos"/>
-          <w:color w:val="1E1E1E"/>
-          <w:sz w:val="23"/>
-        </w:rPr>
-        <w:t>— Eu sou um gato e vejo muito bem no escuro — respondeu Alberto. — Mas vou contigo!</w:t>
-      </w:r>
-    </w:p>
-    <w:p>
-      <w:pPr>
-        <w:widowControl/>
-      </w:pPr>
-      <w:r>
-        <w:rPr>
-          <w:rFonts w:ascii="Aptos" w:hAnsi="Aptos"/>
-          <w:color w:val="1E1E1E"/>
-          <w:sz w:val="23"/>
-        </w:rPr>
-        <w:t>Joaquim sorriu. Ainda faltava um amigo.</w:t>
+        <w:t>— Eu sou um gato e vejo muito bem no escuro — respondeu o Alberto. — Mas vou contigo!</w:t>
+      </w:r>
+    </w:p>
+    <w:p>
+      <w:pPr>
+        <w:widowControl/>
+      </w:pPr>
+      <w:r>
+        <w:t>O Joaquim sorriu. Ainda faltava um amigo.</w:t>
       </w:r>
     </w:p>
     <w:p>
@@ -4874,12 +4374,7 @@
         <w:widowControl/>
       </w:pPr>
       <w:r>
-        <w:rPr>
-          <w:rFonts w:ascii="Aptos" w:hAnsi="Aptos"/>
-          <w:color w:val="1E1E1E"/>
-          <w:sz w:val="23"/>
-        </w:rPr>
-        <w:t>Gilberto chegou a bater as asas e ficou espantado quando soube do plano.</w:t>
+        <w:t>O Gilberto chegou a bater as asas e ficou espantado quando soube do plano.</w:t>
       </w:r>
     </w:p>
     <w:p>
@@ -4900,12 +4395,7 @@
         <w:widowControl/>
       </w:pPr>
       <w:r>
-        <w:rPr>
-          <w:rFonts w:ascii="Aptos" w:hAnsi="Aptos"/>
-          <w:color w:val="1E1E1E"/>
-          <w:sz w:val="23"/>
-        </w:rPr>
-        <w:t>— Temos lanternas, galochas e capacetes — disse Joaquim. — Estamos preparados!</w:t>
+        <w:t>— Temos lanternas, galochas e capacetes — disse o Joaquim. — Estamos preparados!</w:t>
       </w:r>
     </w:p>
     <w:p>
@@ -4939,12 +4429,7 @@
         <w:widowControl/>
       </w:pPr>
       <w:r>
-        <w:rPr>
-          <w:rFonts w:ascii="Aptos" w:hAnsi="Aptos"/>
-          <w:color w:val="1E1E1E"/>
-          <w:sz w:val="23"/>
-        </w:rPr>
-        <w:t>Joaquim ligou a lanterna e iluminou uma criatura pendurada no teto.</w:t>
+        <w:t>O Joaquim ligou a lanterna e iluminou uma criatura pendurada no teto.</w:t>
       </w:r>
     </w:p>
     <w:p>
@@ -4978,12 +4463,7 @@
         <w:widowControl/>
       </w:pPr>
       <w:r>
-        <w:rPr>
-          <w:rFonts w:ascii="Aptos" w:hAnsi="Aptos"/>
-          <w:color w:val="1E1E1E"/>
-          <w:sz w:val="23"/>
-        </w:rPr>
-        <w:t>Joaquim pediu desculpa e explicou que eram exploradores de grutas.</w:t>
+        <w:t>O Joaquim pediu desculpa e explicou que eram exploradores de grutas.</w:t>
       </w:r>
     </w:p>
     <w:p>
@@ -5043,51 +4523,31 @@
         <w:widowControl/>
       </w:pPr>
       <w:r>
-        <w:rPr>
-          <w:rFonts w:ascii="Aptos" w:hAnsi="Aptos"/>
-          <w:color w:val="1E1E1E"/>
-          <w:sz w:val="23"/>
-        </w:rPr>
-        <w:t>Joaquim prendeu-lhe a lanterna ao capacete.</w:t>
-      </w:r>
-    </w:p>
-    <w:p>
-      <w:pPr>
-        <w:widowControl/>
-      </w:pPr>
-      <w:r>
-        <w:rPr>
-          <w:rFonts w:ascii="Aptos" w:hAnsi="Aptos"/>
-          <w:color w:val="1E1E1E"/>
-          <w:sz w:val="23"/>
-        </w:rPr>
-        <w:t>— Agora já vejo! — disse Gilberto, um bocadinho envergonhado.</w:t>
-      </w:r>
-    </w:p>
-    <w:p>
-      <w:pPr>
-        <w:widowControl/>
-      </w:pPr>
-      <w:r>
-        <w:rPr>
-          <w:rFonts w:ascii="Aptos" w:hAnsi="Aptos"/>
-          <w:color w:val="1E1E1E"/>
-          <w:sz w:val="23"/>
-        </w:rPr>
-        <w:t>Salame achou graça e convidou os três amigos a conhecer a sua casa.</w:t>
-      </w:r>
-    </w:p>
-    <w:p>
-      <w:pPr>
-        <w:widowControl/>
-      </w:pPr>
-      <w:r>
-        <w:rPr>
-          <w:rFonts w:ascii="Aptos" w:hAnsi="Aptos"/>
-          <w:color w:val="1E1E1E"/>
-          <w:sz w:val="23"/>
-        </w:rPr>
-        <w:t>A certa altura, Salame pediu silêncio.</w:t>
+        <w:t>O Joaquim prendeu-lhe a lanterna ao capacete.</w:t>
+      </w:r>
+    </w:p>
+    <w:p>
+      <w:pPr>
+        <w:widowControl/>
+      </w:pPr>
+      <w:r>
+        <w:t>— Agora já vejo! — disse o Gilberto, um bocadinho envergonhado.</w:t>
+      </w:r>
+    </w:p>
+    <w:p>
+      <w:pPr>
+        <w:widowControl/>
+      </w:pPr>
+      <w:r>
+        <w:t>O Salame achou graça e convidou os três amigos a conhecer a sua casa.</w:t>
+      </w:r>
+    </w:p>
+    <w:p>
+      <w:pPr>
+        <w:widowControl/>
+      </w:pPr>
+      <w:r>
+        <w:t>A certa altura, o Salame pediu silêncio.</w:t>
       </w:r>
     </w:p>
     <w:p>
@@ -5108,12 +4568,7 @@
         <w:widowControl/>
       </w:pPr>
       <w:r>
-        <w:rPr>
-          <w:rFonts w:ascii="Aptos" w:hAnsi="Aptos"/>
-          <w:color w:val="1E1E1E"/>
-          <w:sz w:val="23"/>
-        </w:rPr>
-        <w:t>Nesse instante, Alberto apontou a lanterna na direção dela.</w:t>
+        <w:t>Nesse instante, o Alberto apontou a lanterna na direção dela.</w:t>
       </w:r>
     </w:p>
     <w:p>
@@ -5134,12 +4589,7 @@
         <w:widowControl/>
       </w:pPr>
       <w:r>
-        <w:rPr>
-          <w:rFonts w:ascii="Aptos" w:hAnsi="Aptos"/>
-          <w:color w:val="1E1E1E"/>
-          <w:sz w:val="23"/>
-        </w:rPr>
-        <w:t>Salame apresentou os amigos e a Senhora Aranha acalmou-se. Depois arrumou a casa num instante com as suas oito patas.</w:t>
+        <w:t>O Salame apresentou os amigos e a Senhora Aranha acalmou-se. Depois arrumou a casa num instante com as suas oito patas.</w:t>
       </w:r>
     </w:p>
     <w:p>
@@ -5186,12 +4636,7 @@
         <w:widowControl/>
       </w:pPr>
       <w:r>
-        <w:rPr>
-          <w:rFonts w:ascii="Aptos" w:hAnsi="Aptos"/>
-          <w:color w:val="1E1E1E"/>
-          <w:sz w:val="23"/>
-        </w:rPr>
-        <w:t>Salame ficou a conversar com ela e os três amigos seguiram caminho.</w:t>
+        <w:t>O Salame ficou a conversar com ela e os três amigos seguiram caminho.</w:t>
       </w:r>
     </w:p>
     <w:p>
@@ -5212,12 +4657,7 @@
         <w:widowControl/>
       </w:pPr>
       <w:r>
-        <w:rPr>
-          <w:rFonts w:ascii="Aptos" w:hAnsi="Aptos"/>
-          <w:color w:val="1E1E1E"/>
-          <w:sz w:val="23"/>
-        </w:rPr>
-        <w:t>Joaquim abriu o mapa que levava no bolso.</w:t>
+        <w:t>O Joaquim abriu o mapa que levava no bolso.</w:t>
       </w:r>
     </w:p>
     <w:p>
@@ -5238,12 +4678,7 @@
         <w:widowControl/>
       </w:pPr>
       <w:r>
-        <w:rPr>
-          <w:rFonts w:ascii="Aptos" w:hAnsi="Aptos"/>
-          <w:color w:val="1E1E1E"/>
-          <w:sz w:val="23"/>
-        </w:rPr>
-        <w:t>Alberto recuou logo duas patas.</w:t>
+        <w:t>O Alberto recuou logo duas patas.</w:t>
       </w:r>
     </w:p>
     <w:p>
@@ -5264,12 +4699,7 @@
         <w:widowControl/>
       </w:pPr>
       <w:r>
-        <w:rPr>
-          <w:rFonts w:ascii="Aptos" w:hAnsi="Aptos"/>
-          <w:color w:val="1E1E1E"/>
-          <w:sz w:val="23"/>
-        </w:rPr>
-        <w:t>Gilberto bateu as asas e foi o primeiro a atravessar a cascata.</w:t>
+        <w:t>O Gilberto bateu as asas e foi o primeiro a atravessar a cascata.</w:t>
       </w:r>
     </w:p>
     <w:p>
@@ -5303,38 +4733,23 @@
         <w:widowControl/>
       </w:pPr>
       <w:r>
-        <w:rPr>
-          <w:rFonts w:ascii="Aptos" w:hAnsi="Aptos"/>
-          <w:color w:val="1E1E1E"/>
-          <w:sz w:val="23"/>
-        </w:rPr>
-        <w:t>Joaquim saltou e escorregou pela água como num escorrega gigante.</w:t>
-      </w:r>
-    </w:p>
-    <w:p>
-      <w:pPr>
-        <w:widowControl/>
-      </w:pPr>
-      <w:r>
-        <w:rPr>
-          <w:rFonts w:ascii="Aptos" w:hAnsi="Aptos"/>
-          <w:color w:val="1E1E1E"/>
-          <w:sz w:val="23"/>
-        </w:rPr>
-        <w:t>Alberto chegou à beira da cascata, olhou para baixo e engoliu em seco.</w:t>
-      </w:r>
-    </w:p>
-    <w:p>
-      <w:pPr>
-        <w:widowControl/>
-      </w:pPr>
-      <w:r>
-        <w:rPr>
-          <w:rFonts w:ascii="Aptos" w:hAnsi="Aptos"/>
-          <w:color w:val="1E1E1E"/>
-          <w:sz w:val="23"/>
-        </w:rPr>
-        <w:t>Joaquim estendeu-lhe uma pata. Alberto fechou os olhos e os dois fizeram a última descida juntos.</w:t>
+        <w:t>O Joaquim saltou e escorregou pela água como num escorrega gigante.</w:t>
+      </w:r>
+    </w:p>
+    <w:p>
+      <w:pPr>
+        <w:widowControl/>
+      </w:pPr>
+      <w:r>
+        <w:t>O Alberto chegou à beira da cascata, olhou para baixo e engoliu em seco.</w:t>
+      </w:r>
+    </w:p>
+    <w:p>
+      <w:pPr>
+        <w:widowControl/>
+      </w:pPr>
+      <w:r>
+        <w:t>O Joaquim estendeu-lhe uma pata. O Alberto fechou os olhos e os dois fizeram a última descida juntos.</w:t>
       </w:r>
     </w:p>
     <w:p>
@@ -5368,12 +4783,7 @@
         <w:widowControl/>
       </w:pPr>
       <w:r>
-        <w:rPr>
-          <w:rFonts w:ascii="Aptos" w:hAnsi="Aptos"/>
-          <w:color w:val="1E1E1E"/>
-          <w:sz w:val="23"/>
-        </w:rPr>
-        <w:t>— Joaquim, estou todo molhado! — resmungou Alberto, a sacudir o pelo.</w:t>
+        <w:t>— Joaquim, estou todo molhado! — resmungou o Alberto, a sacudir o pelo.</w:t>
       </w:r>
     </w:p>
     <w:p>

</xml_diff>

<commit_message>
Rever historia e ilustracoes da gruta
</commit_message>
<xml_diff>
--- a/revisao/as-historias-do-cao-joaquim-textos-para-revisao.docx
+++ b/revisao/as-historias-do-cao-joaquim-textos-para-revisao.docx
@@ -4211,12 +4211,6 @@
         <w:spacing w:after="360"/>
       </w:pPr>
       <w:r>
-        <w:rPr>
-          <w:rFonts w:ascii="Aptos" w:hAnsi="Aptos"/>
-          <w:i/>
-          <w:color w:val="5A5A5A"/>
-          <w:sz w:val="22"/>
-        </w:rPr>
         <w:t>Uma aventura no escuro</w:t>
       </w:r>
     </w:p>
@@ -4225,11 +4219,6 @@
         <w:widowControl/>
       </w:pPr>
       <w:r>
-        <w:rPr>
-          <w:rFonts w:ascii="Aptos" w:hAnsi="Aptos"/>
-          <w:color w:val="1E1E1E"/>
-          <w:sz w:val="23"/>
-        </w:rPr>
         <w:t>Era uma vez um cão chamado Joaquim.</w:t>
       </w:r>
     </w:p>
@@ -4238,11 +4227,6 @@
         <w:widowControl/>
       </w:pPr>
       <w:r>
-        <w:rPr>
-          <w:rFonts w:ascii="Aptos" w:hAnsi="Aptos"/>
-          <w:color w:val="1E1E1E"/>
-          <w:sz w:val="23"/>
-        </w:rPr>
         <w:t>Certa manhã, acordou com vontade de descobrir um lugar escuro e misterioso.</w:t>
       </w:r>
     </w:p>
@@ -4251,11 +4235,6 @@
         <w:widowControl/>
       </w:pPr>
       <w:r>
-        <w:rPr>
-          <w:rFonts w:ascii="Aptos" w:hAnsi="Aptos"/>
-          <w:color w:val="1E1E1E"/>
-          <w:sz w:val="23"/>
-        </w:rPr>
         <w:t>— Já sei! Vou explorar a gruta assustadora que fica aqui perto!</w:t>
       </w:r>
     </w:p>
@@ -4264,11 +4243,6 @@
         <w:widowControl/>
       </w:pPr>
       <w:r>
-        <w:rPr>
-          <w:rFonts w:ascii="Aptos" w:hAnsi="Aptos"/>
-          <w:color w:val="1E1E1E"/>
-          <w:sz w:val="23"/>
-        </w:rPr>
         <w:t>Preparou três lanternas, três pares de galochas e três capacetes para proteger a cabeça.</w:t>
       </w:r>
     </w:p>
@@ -4277,12 +4251,7 @@
         <w:widowControl/>
       </w:pPr>
       <w:r>
-        <w:rPr>
-          <w:rFonts w:ascii="Aptos" w:hAnsi="Aptos"/>
-          <w:color w:val="1E1E1E"/>
-          <w:sz w:val="23"/>
-        </w:rPr>
-        <w:t>Mas uma aventura daquelas não podia ser feita sozinho.</w:t>
+        <w:t>Mas não podia partir sozinho para uma aventura daquelas.</w:t>
       </w:r>
     </w:p>
     <w:p>
@@ -4298,11 +4267,6 @@
         <w:widowControl/>
       </w:pPr>
       <w:r>
-        <w:rPr>
-          <w:rFonts w:ascii="Aptos" w:hAnsi="Aptos"/>
-          <w:color w:val="1E1E1E"/>
-          <w:sz w:val="23"/>
-        </w:rPr>
         <w:t>— Gato Albertooooo!</w:t>
       </w:r>
     </w:p>
@@ -4319,11 +4283,6 @@
         <w:widowControl/>
       </w:pPr>
       <w:r>
-        <w:rPr>
-          <w:rFonts w:ascii="Aptos" w:hAnsi="Aptos"/>
-          <w:color w:val="1E1E1E"/>
-          <w:sz w:val="23"/>
-        </w:rPr>
         <w:t>— Trouxe lanternas, galochas e capacetes. Queres explorar uma gruta comigo?</w:t>
       </w:r>
     </w:p>
@@ -4348,11 +4307,6 @@
         <w:widowControl/>
       </w:pPr>
       <w:r>
-        <w:rPr>
-          <w:rFonts w:ascii="Aptos" w:hAnsi="Aptos"/>
-          <w:color w:val="1E1E1E"/>
-          <w:sz w:val="23"/>
-        </w:rPr>
         <w:t>Os dois encheram os pulmões e gritaram:</w:t>
       </w:r>
     </w:p>
@@ -4361,11 +4315,6 @@
         <w:widowControl/>
       </w:pPr>
       <w:r>
-        <w:rPr>
-          <w:rFonts w:ascii="Aptos" w:hAnsi="Aptos"/>
-          <w:color w:val="1E1E1E"/>
-          <w:sz w:val="23"/>
-        </w:rPr>
         <w:t>— Papagaio Gilbertooooo!</w:t>
       </w:r>
     </w:p>
@@ -4374,19 +4323,14 @@
         <w:widowControl/>
       </w:pPr>
       <w:r>
-        <w:t>O Gilberto chegou a bater as asas e ficou espantado quando soube do plano.</w:t>
-      </w:r>
-    </w:p>
-    <w:p>
-      <w:pPr>
-        <w:widowControl/>
-      </w:pPr>
-      <w:r>
-        <w:rPr>
-          <w:rFonts w:ascii="Aptos" w:hAnsi="Aptos"/>
-          <w:color w:val="1E1E1E"/>
-          <w:sz w:val="23"/>
-        </w:rPr>
+        <w:t>O Gilberto apareceu a bater as asas e ficou espantado quando soube do plano.</w:t>
+      </w:r>
+    </w:p>
+    <w:p>
+      <w:pPr>
+        <w:widowControl/>
+      </w:pPr>
+      <w:r>
         <w:t>— Essa gruta é muito assustadora. Uma vez espreitei lá para dentro e vi muitos olhos!</w:t>
       </w:r>
     </w:p>
@@ -4403,25 +4347,15 @@
         <w:widowControl/>
       </w:pPr>
       <w:r>
-        <w:rPr>
-          <w:rFonts w:ascii="Aptos" w:hAnsi="Aptos"/>
-          <w:color w:val="1E1E1E"/>
-          <w:sz w:val="23"/>
-        </w:rPr>
-        <w:t>Os três amigos apertaram os capacetes e entraram na gruta.</w:t>
-      </w:r>
-    </w:p>
-    <w:p>
-      <w:pPr>
-        <w:widowControl/>
-      </w:pPr>
-      <w:r>
-        <w:rPr>
-          <w:rFonts w:ascii="Aptos" w:hAnsi="Aptos"/>
-          <w:color w:val="1E1E1E"/>
-          <w:sz w:val="23"/>
-        </w:rPr>
-        <w:t>Lá dentro ficou tudo cada vez mais escuro.</w:t>
+        <w:t>Os três amigos ajustaram os capacetes e entraram na gruta.</w:t>
+      </w:r>
+    </w:p>
+    <w:p>
+      <w:pPr>
+        <w:widowControl/>
+      </w:pPr>
+      <w:r>
+        <w:t>Lá dentro, tudo foi ficando cada vez mais escuro.</w:t>
       </w:r>
     </w:p>
     <w:p>
@@ -4437,11 +4371,6 @@
         <w:widowControl/>
       </w:pPr>
       <w:r>
-        <w:rPr>
-          <w:rFonts w:ascii="Aptos" w:hAnsi="Aptos"/>
-          <w:color w:val="1E1E1E"/>
-          <w:sz w:val="23"/>
-        </w:rPr>
         <w:t>Era um morcego que estava a dormir.</w:t>
       </w:r>
     </w:p>
@@ -4450,11 +4379,6 @@
         <w:widowControl/>
       </w:pPr>
       <w:r>
-        <w:rPr>
-          <w:rFonts w:ascii="Aptos" w:hAnsi="Aptos"/>
-          <w:color w:val="1E1E1E"/>
-          <w:sz w:val="23"/>
-        </w:rPr>
         <w:t>— Quem me acordou? Ainda vos dou uma trinca! — resmungou ele.</w:t>
       </w:r>
     </w:p>
@@ -4471,11 +4395,6 @@
         <w:widowControl/>
       </w:pPr>
       <w:r>
-        <w:rPr>
-          <w:rFonts w:ascii="Aptos" w:hAnsi="Aptos"/>
-          <w:color w:val="1E1E1E"/>
-          <w:sz w:val="23"/>
-        </w:rPr>
         <w:t>— Eu sou o Morcego Salame — apresentou-se a criatura. — Chamo-me assim porque gosto muito de salame!</w:t>
       </w:r>
     </w:p>
@@ -4484,11 +4403,6 @@
         <w:widowControl/>
       </w:pPr>
       <w:r>
-        <w:rPr>
-          <w:rFonts w:ascii="Aptos" w:hAnsi="Aptos"/>
-          <w:color w:val="1E1E1E"/>
-          <w:sz w:val="23"/>
-        </w:rPr>
         <w:t>O Morcego Salame olhou para o fundo da gruta.</w:t>
       </w:r>
     </w:p>
@@ -4497,11 +4411,6 @@
         <w:widowControl/>
       </w:pPr>
       <w:r>
-        <w:rPr>
-          <w:rFonts w:ascii="Aptos" w:hAnsi="Aptos"/>
-          <w:color w:val="1E1E1E"/>
-          <w:sz w:val="23"/>
-        </w:rPr>
         <w:t>— Quem é aquele morcego esquisito que anda ali a voar às voltas?</w:t>
       </w:r>
     </w:p>
@@ -4510,11 +4419,6 @@
         <w:widowControl/>
       </w:pPr>
       <w:r>
-        <w:rPr>
-          <w:rFonts w:ascii="Aptos" w:hAnsi="Aptos"/>
-          <w:color w:val="1E1E1E"/>
-          <w:sz w:val="23"/>
-        </w:rPr>
         <w:t>Era o Papagaio Gilberto, completamente perdido porque se tinha esquecido de ligar a lanterna.</w:t>
       </w:r>
     </w:p>
@@ -4555,11 +4459,6 @@
         <w:widowControl/>
       </w:pPr>
       <w:r>
-        <w:rPr>
-          <w:rFonts w:ascii="Aptos" w:hAnsi="Aptos"/>
-          <w:color w:val="1E1E1E"/>
-          <w:sz w:val="23"/>
-        </w:rPr>
         <w:t>— Aqui mora a Senhora Aranha. É uma viúva-negra e não gosta que a acordem.</w:t>
       </w:r>
     </w:p>
@@ -4576,11 +4475,6 @@
         <w:widowControl/>
       </w:pPr>
       <w:r>
-        <w:rPr>
-          <w:rFonts w:ascii="Aptos" w:hAnsi="Aptos"/>
-          <w:color w:val="1E1E1E"/>
-          <w:sz w:val="23"/>
-        </w:rPr>
         <w:t>— Quem entrou na minha casa? Ainda vos mordo! — protestou a aranha.</w:t>
       </w:r>
     </w:p>
@@ -4589,19 +4483,14 @@
         <w:widowControl/>
       </w:pPr>
       <w:r>
-        <w:t>O Salame apresentou os amigos e a Senhora Aranha acalmou-se. Depois arrumou a casa num instante com as suas oito patas.</w:t>
-      </w:r>
-    </w:p>
-    <w:p>
-      <w:pPr>
-        <w:widowControl/>
-      </w:pPr>
-      <w:r>
-        <w:rPr>
-          <w:rFonts w:ascii="Aptos" w:hAnsi="Aptos"/>
-          <w:color w:val="1E1E1E"/>
-          <w:sz w:val="23"/>
-        </w:rPr>
+        <w:t>O Salame apresentou os amigos e a Senhora Aranha acalmou-se. Depois, arrumou a casa num instante com as suas oito patas.</w:t>
+      </w:r>
+    </w:p>
+    <w:p>
+      <w:pPr>
+        <w:widowControl/>
+      </w:pPr>
+      <w:r>
         <w:t>— Querem comer alguns insetos?</w:t>
       </w:r>
     </w:p>
@@ -4610,11 +4499,6 @@
         <w:widowControl/>
       </w:pPr>
       <w:r>
-        <w:rPr>
-          <w:rFonts w:ascii="Aptos" w:hAnsi="Aptos"/>
-          <w:color w:val="1E1E1E"/>
-          <w:sz w:val="23"/>
-        </w:rPr>
         <w:t>Os três agradeceram, mas ninguém tinha fome.</w:t>
       </w:r>
     </w:p>
@@ -4623,12 +4507,7 @@
         <w:widowControl/>
       </w:pPr>
       <w:r>
-        <w:rPr>
-          <w:rFonts w:ascii="Aptos" w:hAnsi="Aptos"/>
-          <w:color w:val="1E1E1E"/>
-          <w:sz w:val="23"/>
-        </w:rPr>
-        <w:t>— Podem continuar até ao fundo — disse a Senhora Aranha. — Lá encontrarão uma cascata, mas tenham cuidado!</w:t>
+        <w:t>— Podem continuar até ao fundo — disse a Senhora Aranha. — Lá vão encontrar uma cascata, mas tenham cuidado!</w:t>
       </w:r>
     </w:p>
     <w:p>
@@ -4644,11 +4523,6 @@
         <w:widowControl/>
       </w:pPr>
       <w:r>
-        <w:rPr>
-          <w:rFonts w:ascii="Aptos" w:hAnsi="Aptos"/>
-          <w:color w:val="1E1E1E"/>
-          <w:sz w:val="23"/>
-        </w:rPr>
         <w:t>Passaram entre estalactites e estalagmites até chegarem a um rio escondido dentro da gruta.</w:t>
       </w:r>
     </w:p>
@@ -4665,11 +4539,6 @@
         <w:widowControl/>
       </w:pPr>
       <w:r>
-        <w:rPr>
-          <w:rFonts w:ascii="Aptos" w:hAnsi="Aptos"/>
-          <w:color w:val="1E1E1E"/>
-          <w:sz w:val="23"/>
-        </w:rPr>
         <w:t>— Esta cascata vai dar ao mar! Podemos sair por aqui!</w:t>
       </w:r>
     </w:p>
@@ -4678,19 +4547,14 @@
         <w:widowControl/>
       </w:pPr>
       <w:r>
-        <w:t>O Alberto recuou logo duas patas.</w:t>
-      </w:r>
-    </w:p>
-    <w:p>
-      <w:pPr>
-        <w:widowControl/>
-      </w:pPr>
-      <w:r>
-        <w:rPr>
-          <w:rFonts w:ascii="Aptos" w:hAnsi="Aptos"/>
-          <w:color w:val="1E1E1E"/>
-          <w:sz w:val="23"/>
-        </w:rPr>
+        <w:t>O Alberto recuou logo dois passos.</w:t>
+      </w:r>
+    </w:p>
+    <w:p>
+      <w:pPr>
+        <w:widowControl/>
+      </w:pPr>
+      <w:r>
         <w:t>— Água, Joaquim? Eu sou um gato. Não gosto de água!</w:t>
       </w:r>
     </w:p>
@@ -4707,11 +4571,6 @@
         <w:widowControl/>
       </w:pPr>
       <w:r>
-        <w:rPr>
-          <w:rFonts w:ascii="Aptos" w:hAnsi="Aptos"/>
-          <w:color w:val="1E1E1E"/>
-          <w:sz w:val="23"/>
-        </w:rPr>
         <w:t>Pouco depois, ouviram-no gritar do outro lado:</w:t>
       </w:r>
     </w:p>
@@ -4720,11 +4579,6 @@
         <w:widowControl/>
       </w:pPr>
       <w:r>
-        <w:rPr>
-          <w:rFonts w:ascii="Aptos" w:hAnsi="Aptos"/>
-          <w:color w:val="1E1E1E"/>
-          <w:sz w:val="23"/>
-        </w:rPr>
         <w:t>— Estou no mar! Podem vir!</w:t>
       </w:r>
     </w:p>
@@ -4757,11 +4611,6 @@
         <w:widowControl/>
       </w:pPr>
       <w:r>
-        <w:rPr>
-          <w:rFonts w:ascii="Aptos" w:hAnsi="Aptos"/>
-          <w:color w:val="1E1E1E"/>
-          <w:sz w:val="23"/>
-        </w:rPr>
         <w:t>Chuááá! Foram parar ao mar.</w:t>
       </w:r>
     </w:p>
@@ -4770,11 +4619,6 @@
         <w:widowControl/>
       </w:pPr>
       <w:r>
-        <w:rPr>
-          <w:rFonts w:ascii="Aptos" w:hAnsi="Aptos"/>
-          <w:color w:val="1E1E1E"/>
-          <w:sz w:val="23"/>
-        </w:rPr>
         <w:t>Quando saíram da água, perceberam que o céu já estava a escurecer.</w:t>
       </w:r>
     </w:p>
@@ -4791,24 +4635,14 @@
         <w:widowControl/>
       </w:pPr>
       <w:r>
-        <w:rPr>
-          <w:rFonts w:ascii="Aptos" w:hAnsi="Aptos"/>
-          <w:color w:val="1E1E1E"/>
-          <w:sz w:val="23"/>
-        </w:rPr>
-        <w:t>Mesmo assim, o gato não conseguiu esconder um sorriso. A gruta tinha sido assustadora, mas também muito divertida.</w:t>
-      </w:r>
-    </w:p>
-    <w:p>
-      <w:pPr>
-        <w:widowControl/>
-      </w:pPr>
-      <w:r>
-        <w:rPr>
-          <w:rFonts w:ascii="Aptos" w:hAnsi="Aptos"/>
-          <w:color w:val="1E1E1E"/>
-          <w:sz w:val="23"/>
-        </w:rPr>
+        <w:t>Mesmo assim, o Alberto não conseguiu esconder um sorriso. A gruta tinha sido assustadora, mas também muito divertida.</w:t>
+      </w:r>
+    </w:p>
+    <w:p>
+      <w:pPr>
+        <w:widowControl/>
+      </w:pPr>
+      <w:r>
         <w:t>Os três amigos regressaram a casa e despediram-se:</w:t>
       </w:r>
     </w:p>
@@ -4817,11 +4651,6 @@
         <w:widowControl/>
       </w:pPr>
       <w:r>
-        <w:rPr>
-          <w:rFonts w:ascii="Aptos" w:hAnsi="Aptos"/>
-          <w:color w:val="1E1E1E"/>
-          <w:sz w:val="23"/>
-        </w:rPr>
         <w:t>— Boa noite! Até amanhã!</w:t>
       </w:r>
     </w:p>
@@ -4830,11 +4659,6 @@
         <w:widowControl/>
       </w:pPr>
       <w:r>
-        <w:rPr>
-          <w:rFonts w:ascii="Aptos" w:hAnsi="Aptos"/>
-          <w:color w:val="1E1E1E"/>
-          <w:sz w:val="23"/>
-        </w:rPr>
         <w:t>Depois de lanternas, morcegos, aranhas e cascatas, estavam prontos para dormir e sonhar com a próxima aventura.</w:t>
       </w:r>
     </w:p>
@@ -4844,12 +4668,6 @@
         <w:jc w:val="center"/>
       </w:pPr>
       <w:r>
-        <w:rPr>
-          <w:rFonts w:ascii="Aptos" w:hAnsi="Aptos"/>
-          <w:i/>
-          <w:color w:val="1E1E1E"/>
-          <w:sz w:val="23"/>
-        </w:rPr>
         <w:t>Fim.</w:t>
       </w:r>
     </w:p>

</xml_diff>